<commit_message>
feat: painel de interesses recebidos do protetor (#29)
</commit_message>
<xml_diff>
--- a/docs/requisitos/casos-de-uso-adota-aqui.docx
+++ b/docs/requisitos/casos-de-uso-adota-aqui.docx
@@ -598,7 +598,7 @@
           <w:szCs w:val="30"/>
           <w:rtl w:val="0"/>
         </w:rPr>
-        <w:t xml:space="preserve">UC01 — Cadastrar Usuario</w:t>
+        <w:t xml:space="preserve">UC01 - Cadastrar Usuario</w:t>
       </w:r>
       <w:r>
         <w:rPr>
@@ -1340,7 +1340,7 @@
                 <w:szCs w:val="24"/>
                 <w:rtl w:val="0"/>
               </w:rPr>
-              <w:t xml:space="preserve">FA01 — Campos obrigatórios não preenchidos</w:t>
+              <w:t xml:space="preserve">FA01 - Campos obrigatórios não preenchidos</w:t>
             </w:r>
           </w:p>
           <w:p>
@@ -1449,7 +1449,7 @@
                 <w:szCs w:val="24"/>
                 <w:rtl w:val="0"/>
               </w:rPr>
-              <w:t xml:space="preserve">FA02 — CPF já cadastrado.</w:t>
+              <w:t xml:space="preserve">FA02 - CPF já cadastrado.</w:t>
             </w:r>
           </w:p>
           <w:p>
@@ -1558,7 +1558,7 @@
                 <w:szCs w:val="24"/>
                 <w:rtl w:val="0"/>
               </w:rPr>
-              <w:t xml:space="preserve">FA03 — Senha e confirmação de senha não conferem.</w:t>
+              <w:t xml:space="preserve">FA03 - Senha e confirmação de senha não conferem.</w:t>
             </w:r>
           </w:p>
           <w:p>
@@ -1870,7 +1870,7 @@
           <w:szCs w:val="30"/>
           <w:rtl w:val="0"/>
         </w:rPr>
-        <w:t xml:space="preserve">UC02 — Cadastrar Ong/Abrigo</w:t>
+        <w:t xml:space="preserve">UC02 - Cadastrar Ong/Abrigo</w:t>
       </w:r>
       <w:r>
         <w:rPr>
@@ -2631,7 +2631,7 @@
                 <w:szCs w:val="24"/>
                 <w:rtl w:val="0"/>
               </w:rPr>
-              <w:t xml:space="preserve">FA01 — Campos obrigatórios não preenchidos</w:t>
+              <w:t xml:space="preserve">FA01 - Campos obrigatórios não preenchidos</w:t>
             </w:r>
           </w:p>
           <w:p>
@@ -2740,7 +2740,7 @@
                 <w:szCs w:val="24"/>
                 <w:rtl w:val="0"/>
               </w:rPr>
-              <w:t xml:space="preserve">FA02 — CNPJ ou e-mail já cadastrado</w:t>
+              <w:t xml:space="preserve">FA02 - CNPJ ou e-mail já cadastrado</w:t>
             </w:r>
           </w:p>
           <w:p>
@@ -2827,7 +2827,7 @@
                 <w:szCs w:val="24"/>
                 <w:rtl w:val="0"/>
               </w:rPr>
-              <w:t xml:space="preserve">FA03 — Senha e confirmação de senha não conferem.</w:t>
+              <w:t xml:space="preserve">FA03 - Senha e confirmação de senha não conferem.</w:t>
             </w:r>
           </w:p>
           <w:p>
@@ -3175,7 +3175,7 @@
           <w:szCs w:val="30"/>
           <w:rtl w:val="0"/>
         </w:rPr>
-        <w:t xml:space="preserve">UC03 — Realizar Login</w:t>
+        <w:t xml:space="preserve">UC03 - Realizar Login</w:t>
       </w:r>
       <w:r>
         <w:rPr>
@@ -3923,7 +3923,7 @@
                 <w:szCs w:val="24"/>
                 <w:rtl w:val="0"/>
               </w:rPr>
-              <w:t xml:space="preserve">FA01 — Usuario não encontrado:</w:t>
+              <w:t xml:space="preserve">FA01 - Usuario não encontrado:</w:t>
             </w:r>
             <w:r>
               <w:rPr>
@@ -3991,7 +3991,7 @@
                 <w:szCs w:val="24"/>
                 <w:rtl w:val="0"/>
               </w:rPr>
-              <w:t xml:space="preserve">FA02 — Senha inválida:</w:t>
+              <w:t xml:space="preserve">FA02 - Senha inválida:</w:t>
             </w:r>
             <w:r>
               <w:rPr>
@@ -4059,7 +4059,7 @@
                 <w:szCs w:val="24"/>
                 <w:rtl w:val="0"/>
               </w:rPr>
-              <w:t xml:space="preserve">FA03 — Campos obrigatórios não preenchidos:</w:t>
+              <w:t xml:space="preserve">FA03 - Campos obrigatórios não preenchidos:</w:t>
             </w:r>
             <w:r>
               <w:rPr>
@@ -4127,7 +4127,7 @@
                 <w:szCs w:val="24"/>
                 <w:rtl w:val="0"/>
               </w:rPr>
-              <w:t xml:space="preserve">FA04 — Erro interno:</w:t>
+              <w:t xml:space="preserve">FA04 - Erro interno:</w:t>
             </w:r>
             <w:r>
               <w:rPr>
@@ -4198,7 +4198,7 @@
                 <w:szCs w:val="24"/>
                 <w:rtl w:val="0"/>
               </w:rPr>
-              <w:t xml:space="preserve">FA05 — Documento inválido</w:t>
+              <w:t xml:space="preserve">FA05 - Documento inválido</w:t>
             </w:r>
           </w:p>
           <w:p>
@@ -4529,7 +4529,7 @@
           <w:szCs w:val="30"/>
           <w:rtl w:val="0"/>
         </w:rPr>
-        <w:t xml:space="preserve">UC04 — Cadastrar Animal</w:t>
+        <w:t xml:space="preserve">UC04 - Cadastrar Animal</w:t>
       </w:r>
       <w:r>
         <w:rPr>
@@ -5348,7 +5348,7 @@
                 <w:szCs w:val="24"/>
                 <w:rtl w:val="0"/>
               </w:rPr>
-              <w:t xml:space="preserve">FA01 — Campos obrigatórios não preenchidos</w:t>
+              <w:t xml:space="preserve">FA01 - Campos obrigatórios não preenchidos</w:t>
             </w:r>
           </w:p>
           <w:p>
@@ -5457,7 +5457,7 @@
                 <w:szCs w:val="24"/>
                 <w:rtl w:val="0"/>
               </w:rPr>
-              <w:t xml:space="preserve">FA02 — Dados inválidos</w:t>
+              <w:t xml:space="preserve">FA02 - Dados inválidos</w:t>
             </w:r>
           </w:p>
           <w:p>
@@ -5566,7 +5566,7 @@
                 <w:szCs w:val="24"/>
                 <w:rtl w:val="0"/>
               </w:rPr>
-              <w:t xml:space="preserve">FA03 — Erro no cadastro</w:t>
+              <w:t xml:space="preserve">FA03 - Erro no cadastro</w:t>
             </w:r>
           </w:p>
           <w:p>
@@ -5905,7 +5905,7 @@
           <w:szCs w:val="30"/>
           <w:rtl w:val="0"/>
         </w:rPr>
-        <w:t xml:space="preserve">UC05 — Editar/Remover Animal</w:t>
+        <w:t xml:space="preserve">UC05 - Editar/Remover Animal</w:t>
       </w:r>
       <w:r>
         <w:rPr>
@@ -6666,7 +6666,7 @@
                 <w:szCs w:val="24"/>
                 <w:rtl w:val="0"/>
               </w:rPr>
-              <w:t xml:space="preserve">FA01 — Campos obrigatórios não preenchidos</w:t>
+              <w:t xml:space="preserve">FA01 - Campos obrigatórios não preenchidos</w:t>
             </w:r>
           </w:p>
           <w:p>
@@ -6775,7 +6775,7 @@
                 <w:szCs w:val="24"/>
                 <w:rtl w:val="0"/>
               </w:rPr>
-              <w:t xml:space="preserve">FA02 — Dados inválidos</w:t>
+              <w:t xml:space="preserve">FA02 - Dados inválidos</w:t>
             </w:r>
           </w:p>
           <w:p>
@@ -6884,7 +6884,7 @@
                 <w:szCs w:val="24"/>
                 <w:rtl w:val="0"/>
               </w:rPr>
-              <w:t xml:space="preserve">FA03 — Usuario opta por remover o animal</w:t>
+              <w:t xml:space="preserve">FA03 - Usuario opta por remover o animal</w:t>
             </w:r>
           </w:p>
           <w:p>
@@ -7040,7 +7040,7 @@
                 <w:szCs w:val="24"/>
                 <w:rtl w:val="0"/>
               </w:rPr>
-              <w:t xml:space="preserve">FA04 — Protetor edita animal com status “Adotado”</w:t>
+              <w:t xml:space="preserve">FA04 - Protetor edita animal com status “Adotado”</w:t>
             </w:r>
           </w:p>
           <w:p>
@@ -7223,7 +7223,7 @@
                 <w:szCs w:val="24"/>
                 <w:rtl w:val="0"/>
               </w:rPr>
-              <w:t xml:space="preserve">FA05 — Usuario cancela a remoção</w:t>
+              <w:t xml:space="preserve">FA05 - Usuario cancela a remoção</w:t>
             </w:r>
           </w:p>
           <w:p>
@@ -7712,7 +7712,7 @@
           <w:szCs w:val="30"/>
           <w:rtl w:val="0"/>
         </w:rPr>
-        <w:t xml:space="preserve">UC06 — Listar/Buscar Animais</w:t>
+        <w:t xml:space="preserve">UC06 - Listar/Buscar Animais</w:t>
       </w:r>
       <w:r>
         <w:rPr>
@@ -8400,7 +8400,7 @@
                 <w:szCs w:val="24"/>
                 <w:rtl w:val="0"/>
               </w:rPr>
-              <w:t xml:space="preserve">FA01 — Nenhum animal disponível no estado do usuário autenticado</w:t>
+              <w:t xml:space="preserve">FA01 - Nenhum animal disponível no estado do usuário autenticado</w:t>
             </w:r>
           </w:p>
           <w:p>
@@ -8465,7 +8465,7 @@
                 <w:szCs w:val="24"/>
                 <w:rtl w:val="0"/>
               </w:rPr>
-              <w:t xml:space="preserve">FA02 — Filtro sem resultados</w:t>
+              <w:t xml:space="preserve">FA02 - Filtro sem resultados</w:t>
             </w:r>
           </w:p>
           <w:p>
@@ -8686,7 +8686,7 @@
           <w:szCs w:val="30"/>
           <w:rtl w:val="0"/>
         </w:rPr>
-        <w:t xml:space="preserve">UC07 — Demonstrar Interesse</w:t>
+        <w:t xml:space="preserve">UC07 - Demonstrar Interesse</w:t>
       </w:r>
       <w:r>
         <w:rPr>
@@ -9494,7 +9494,7 @@
                 <w:szCs w:val="24"/>
                 <w:rtl w:val="0"/>
               </w:rPr>
-              <w:t xml:space="preserve">FA01 — Usuario clica em “Desistir da adoção”:</w:t>
+              <w:t xml:space="preserve">FA01 - Usuario clica em “Desistir da adoção”:</w:t>
             </w:r>
             <w:r>
               <w:rPr>
@@ -9626,7 +9626,7 @@
                 <w:szCs w:val="24"/>
                 <w:rtl w:val="0"/>
               </w:rPr>
-              <w:t xml:space="preserve">FA02 — Usuario não marca o checkbox declarando compromisso:</w:t>
+              <w:t xml:space="preserve">FA02 - Usuario não marca o checkbox declarando compromisso:</w:t>
             </w:r>
             <w:r>
               <w:rPr>
@@ -9887,7 +9887,7 @@
           <w:szCs w:val="30"/>
           <w:rtl w:val="0"/>
         </w:rPr>
-        <w:t xml:space="preserve">UC08 — Gerenciar Interesses Recebidos</w:t>
+        <w:t xml:space="preserve">UC08 - Gerenciar Interesses Recebidos</w:t>
       </w:r>
       <w:r>
         <w:rPr>
@@ -10709,7 +10709,7 @@
                 <w:szCs w:val="24"/>
                 <w:rtl w:val="0"/>
               </w:rPr>
-              <w:t xml:space="preserve">FA01 — Protetor aprova o interesse do Candidato escolhido, enquanto ainda há registros de outros Candidatos</w:t>
+              <w:t xml:space="preserve">FA01 - Protetor aprova o interesse do Candidato escolhido, enquanto ainda há registros de outros Candidatos</w:t>
             </w:r>
             <w:r>
               <w:rPr>
@@ -10935,7 +10935,7 @@
           <w:szCs w:val="30"/>
           <w:rtl w:val="0"/>
         </w:rPr>
-        <w:t xml:space="preserve">UC09 — Registrar Depoimento</w:t>
+        <w:t xml:space="preserve">UC09 - Registrar Depoimento</w:t>
       </w:r>
       <w:r>
         <w:rPr>
@@ -11715,7 +11715,7 @@
                 <w:szCs w:val="24"/>
                 <w:rtl w:val="0"/>
               </w:rPr>
-              <w:t xml:space="preserve">FA01 — Usuario não informa depoimento em texto:</w:t>
+              <w:t xml:space="preserve">FA01 - Usuario não informa depoimento em texto:</w:t>
             </w:r>
           </w:p>
           <w:p>
@@ -11780,7 +11780,7 @@
                 <w:szCs w:val="24"/>
                 <w:rtl w:val="0"/>
               </w:rPr>
-              <w:t xml:space="preserve">FA02 — Foto não adicionada:</w:t>
+              <w:t xml:space="preserve">FA02 - Foto não adicionada:</w:t>
             </w:r>
           </w:p>
           <w:p>
@@ -12049,7 +12049,7 @@
           <w:szCs w:val="30"/>
           <w:rtl w:val="0"/>
         </w:rPr>
-        <w:t xml:space="preserve">UC10 — Editar Perfil</w:t>
+        <w:t xml:space="preserve">UC10 - Editar Perfil</w:t>
       </w:r>
       <w:r>
         <w:rPr>
@@ -12741,7 +12741,7 @@
                     <w:szCs w:val="24"/>
                     <w:rtl w:val="0"/>
                   </w:rPr>
-                  <w:t xml:space="preserve">FA01 — Campos obrigatórios não preenchidos: </w:t>
+                  <w:t xml:space="preserve">FA01 - Campos obrigatórios não preenchidos: </w:t>
                 </w:r>
               </w:p>
               <w:p>
@@ -12829,7 +12829,7 @@
                     <w:szCs w:val="24"/>
                     <w:rtl w:val="0"/>
                   </w:rPr>
-                  <w:t xml:space="preserve">FA02 — E-mail já cadastrado:</w:t>
+                  <w:t xml:space="preserve">FA02 - E-mail já cadastrado:</w:t>
                 </w:r>
                 <w:r>
                   <w:rPr>
@@ -12904,7 +12904,7 @@
                     <w:szCs w:val="24"/>
                     <w:rtl w:val="0"/>
                   </w:rPr>
-                  <w:t xml:space="preserve">FA03 — Alteração de senha: </w:t>
+                  <w:t xml:space="preserve">FA03 - Alteração de senha: </w:t>
                 </w:r>
               </w:p>
               <w:p>
@@ -13038,7 +13038,7 @@
                     <w:szCs w:val="24"/>
                     <w:rtl w:val="0"/>
                   </w:rPr>
-                  <w:t xml:space="preserve">FA04 — Senha atual incorreta</w:t>
+                  <w:t xml:space="preserve">FA04 - Senha atual incorreta</w:t>
                 </w:r>
                 <w:r>
                   <w:rPr>
@@ -13111,7 +13111,7 @@
                     <w:szCs w:val="24"/>
                     <w:rtl w:val="0"/>
                   </w:rPr>
-                  <w:t xml:space="preserve">FA05 — Nova senha e confirmação não conferem:</w:t>
+                  <w:t xml:space="preserve">FA05 - Nova senha e confirmação não conferem:</w:t>
                 </w:r>
                 <w:r>
                   <w:rPr>
@@ -13207,7 +13207,7 @@
                     <w:szCs w:val="24"/>
                     <w:rtl w:val="0"/>
                   </w:rPr>
-                  <w:t xml:space="preserve">FA06 — Alteração de endereço:</w:t>
+                  <w:t xml:space="preserve">FA06 - Alteração de endereço:</w:t>
                 </w:r>
                 <w:r>
                   <w:rPr>
@@ -13280,7 +13280,7 @@
                     <w:szCs w:val="24"/>
                     <w:rtl w:val="0"/>
                   </w:rPr>
-                  <w:t xml:space="preserve">FA07 — Usuario cancela a edição:</w:t>
+                  <w:t xml:space="preserve">FA07 - Usuario cancela a edição:</w:t>
                 </w:r>
                 <w:r>
                   <w:rPr>

</xml_diff>

<commit_message>
docs: revisão da documentação contra o que foi implementado (#43)
</commit_message>
<xml_diff>
--- a/docs/requisitos/casos-de-uso-adota-aqui.docx
+++ b/docs/requisitos/casos-de-uso-adota-aqui.docx
@@ -3973,7 +3973,7 @@
                 <w:szCs w:val="24"/>
                 <w:rtl w:val="0"/>
               </w:rPr>
-              <w:t xml:space="preserve">O sistema informa que o usuário não foi identificado.</w:t>
+              <w:t>O sistema informa que o CPF/CNPJ ou a senha são inválidos, com a mesma mensagem da FA02, para não revelar quais documentos têm conta.</w:t>
             </w:r>
           </w:p>
           <w:p>
@@ -4041,7 +4041,7 @@
                 <w:szCs w:val="24"/>
                 <w:rtl w:val="0"/>
               </w:rPr>
-              <w:t xml:space="preserve"> O sistema informa que as credenciais são inválidas.</w:t>
+              <w:t>O sistema informa que o CPF/CNPJ ou a senha são inválidos.</w:t>
             </w:r>
           </w:p>
           <w:p>
@@ -8239,7 +8239,7 @@
                 <w:szCs w:val="24"/>
                 <w:rtl w:val="0"/>
               </w:rPr>
-              <w:t xml:space="preserve">O sistema exibe os animais com status “disponível”no mesmo estado do Usuario autenticado (RF14) ou, para o Visitante, de todos os estados, cada um com nome, foto, espécie, porte e o nome do Protetor responsável pelo cadastro (RF07).</w:t>
+              <w:t>O sistema exibe os animais com status “disponível”no mesmo estado do Usuario autenticado (RF14) ou, para o Visitante e o Abrigo, de todos os estados, cada um com nome, foto, espécie, porte e o nome do Protetor responsável pelo cadastro (RF07).</w:t>
             </w:r>
           </w:p>
           <w:p>
@@ -8261,7 +8261,7 @@
                 <w:szCs w:val="24"/>
                 <w:rtl w:val="0"/>
               </w:rPr>
-              <w:t xml:space="preserve">O usuário pode aplicar filtros por cidade, espécie, porte, sexo, raça, e atributos de convivência (bom com crianças, bom com cães, bom com gatos, nível de energia).</w:t>
+              <w:t>O usuário pode buscar pelo nome do animal ou do protetor e aplicar filtros por cidade, espécie, porte, sexo, raça e atributos de convivência (bom com crianças, bom com cães, bom com gatos, nível de energia).</w:t>
             </w:r>
           </w:p>
           <w:p>
@@ -9382,7 +9382,7 @@
                 <w:szCs w:val="24"/>
                 <w:rtl w:val="0"/>
               </w:rPr>
-              <w:t xml:space="preserve">O sistema troca o botão “Demonstrar interesse” por “Desistir da adoção”.</w:t>
+              <w:t>O sistema troca o botão “Quero conhecer” pelo status do interesse e pelo botão “Desistir da adoção”.</w:t>
             </w:r>
           </w:p>
           <w:p>
@@ -9403,7 +9403,7 @@
                 <w:szCs w:val="24"/>
                 <w:rtl w:val="0"/>
               </w:rPr>
-              <w:t xml:space="preserve">O sistema notifica o Protetor responsável pelo animal sobre o novo interesse.</w:t>
+              <w:t>O interesse aparece como pendente no painel de interesses recebidos do Protetor (UC08). No MVP, essa é a notificação do RF09: não há envio de e-mail.</w:t>
             </w:r>
           </w:p>
           <w:p>
@@ -9523,7 +9523,7 @@
                 <w:szCs w:val="24"/>
                 <w:rtl w:val="0"/>
               </w:rPr>
-              <w:t xml:space="preserve">O sistema disponibiliza um formulário de confirmação com uma caixa de texto OPCIONAL para o usuário redigir o motivo da desistência e botão de “Confirmar Desistência”.</w:t>
+              <w:t>O sistema solicita a confirmação da desistência.</w:t>
             </w:r>
           </w:p>
           <w:p>
@@ -9564,46 +9564,7 @@
                 <w:szCs w:val="24"/>
                 <w:rtl w:val="0"/>
               </w:rPr>
-              <w:t xml:space="preserve">O Sistema exclui o interesse.</w:t>
-            </w:r>
-            <w:r>
-              <w:rPr>
-                <w:rtl w:val="0"/>
-              </w:rPr>
-            </w:r>
-          </w:p>
-          <w:p>
-            <w:pPr>
-              <w:keepNext w:val="0"/>
-              <w:keepLines w:val="0"/>
-              <w:widowControl w:val="1"/>
-              <w:numPr>
-                <w:ilvl w:val="0"/>
-                <w:numId w:val="13"/>
-              </w:numPr>
-              <w:pBdr>
-                <w:top w:space="0" w:sz="0" w:val="nil"/>
-                <w:left w:space="0" w:sz="0" w:val="nil"/>
-                <w:bottom w:space="0" w:sz="0" w:val="nil"/>
-                <w:right w:space="0" w:sz="0" w:val="nil"/>
-                <w:between w:space="0" w:sz="0" w:val="nil"/>
-              </w:pBdr>
-              <w:shd w:fill="auto" w:val="clear"/>
-              <w:spacing w:after="0" w:before="0" w:line="240" w:lineRule="auto"/>
-              <w:ind w:left="720" w:right="0" w:hanging="360"/>
-              <w:jc w:val="left"/>
-              <w:rPr>
-                <w:sz w:val="24"/>
-                <w:szCs w:val="24"/>
-              </w:rPr>
-            </w:pPr>
-            <w:r>
-              <w:rPr>
-                <w:sz w:val="24"/>
-                <w:szCs w:val="24"/>
-                <w:rtl w:val="0"/>
-              </w:rPr>
-              <w:t xml:space="preserve">O Sistema notifica o Protetor sobre a desistência do usuário Candidato.</w:t>
+              <w:t>O sistema exclui o interesse, que deixa de aparecer no painel de interesses recebidos do Protetor (UC08).</w:t>
             </w:r>
             <w:r>
               <w:rPr>
@@ -10749,6 +10710,122 @@
                 <w:rtl w:val="0"/>
               </w:rPr>
               <w:t xml:space="preserve"> demais interesses pendentes/em contato do mesmo animal são descontinuados automaticamente, com um motivo padrão preenchido pelo sistema.</w:t>
+            </w:r>
+          </w:p>
+          <w:p>
+            <w:pPr>
+              <w:rPr>
+                <w:sz w:val="24"/>
+                <w:szCs w:val="24"/>
+              </w:rPr>
+            </w:pPr>
+            <w:r>
+              <w:rPr>
+                <w:b w:val="1"/>
+                <w:bCs w:val="1"/>
+                <w:sz w:val="24"/>
+                <w:szCs w:val="24"/>
+                <w:rtl w:val="0"/>
+              </w:rPr>
+              <w:t>FA02 - Protetor descontinua um interesse</w:t>
+            </w:r>
+            <w:r>
+              <w:rPr>
+                <w:sz w:val="24"/>
+                <w:szCs w:val="24"/>
+                <w:rtl w:val="0"/>
+              </w:rPr>
+              <w:t xml:space="preserve"> </w:t>
+            </w:r>
+          </w:p>
+          <w:p>
+            <w:pPr>
+              <w:numPr>
+                <w:ilvl w:val="0"/>
+                <w:numId w:val="60"/>
+              </w:numPr>
+              <w:ind w:left="720" w:hanging="360"/>
+              <w:rPr>
+                <w:color w:val="000000"/>
+                <w:sz w:val="24"/>
+                <w:szCs w:val="24"/>
+              </w:rPr>
+            </w:pPr>
+            <w:r>
+              <w:rPr>
+                <w:sz w:val="24"/>
+                <w:szCs w:val="24"/>
+                <w:rtl w:val="0"/>
+              </w:rPr>
+              <w:t>O Protetor seleciona “Descontinuar” em um interesse pendente ou em contato.</w:t>
+            </w:r>
+            <w:r>
+              <w:rPr>
+                <w:color w:val="000000"/>
+                <w:sz w:val="24"/>
+                <w:szCs w:val="24"/>
+                <w:rtl w:val="0"/>
+              </w:rPr>
+            </w:r>
+          </w:p>
+          <w:p>
+            <w:pPr>
+              <w:numPr>
+                <w:ilvl w:val="0"/>
+                <w:numId w:val="60"/>
+              </w:numPr>
+              <w:ind w:left="720" w:hanging="360"/>
+              <w:rPr>
+                <w:color w:val="000000"/>
+                <w:sz w:val="24"/>
+                <w:szCs w:val="24"/>
+              </w:rPr>
+            </w:pPr>
+            <w:r>
+              <w:rPr>
+                <w:sz w:val="24"/>
+                <w:szCs w:val="24"/>
+                <w:rtl w:val="0"/>
+              </w:rPr>
+              <w:t>O sistema solicita o motivo da descontinuação, de preenchimento obrigatório (RF10).</w:t>
+            </w:r>
+            <w:r>
+              <w:rPr>
+                <w:color w:val="000000"/>
+                <w:sz w:val="24"/>
+                <w:szCs w:val="24"/>
+                <w:rtl w:val="0"/>
+              </w:rPr>
+            </w:r>
+          </w:p>
+          <w:p>
+            <w:pPr>
+              <w:numPr>
+                <w:ilvl w:val="0"/>
+                <w:numId w:val="60"/>
+              </w:numPr>
+              <w:ind w:left="720" w:hanging="360"/>
+              <w:rPr>
+                <w:color w:val="000000"/>
+                <w:sz w:val="24"/>
+                <w:szCs w:val="24"/>
+              </w:rPr>
+            </w:pPr>
+            <w:r>
+              <w:rPr>
+                <w:sz w:val="24"/>
+                <w:szCs w:val="24"/>
+                <w:rtl w:val="0"/>
+              </w:rPr>
+              <w:t>O sistema registra o interesse como descontinuado, junto com o motivo informado.</w:t>
+            </w:r>
+            <w:r>
+              <w:rPr>
+                <w:color w:val="000000"/>
+                <w:sz w:val="24"/>
+                <w:szCs w:val="24"/>
+                <w:rtl w:val="0"/>
+              </w:rPr>
             </w:r>
           </w:p>
         </w:tc>
@@ -20298,6 +20375,12 @@
   <w:num w:numId="59">
     <w:abstractNumId w:val="59"/>
   </w:num>
+  <w:num w:numId="60">
+    <w:abstractNumId w:val="39"/>
+    <w:lvlOverride w:ilvl="0">
+      <w:startOverride w:val="1"/>
+    </w:lvlOverride>
+  </w:num>
 </w:numbering>
 </file>
 

</xml_diff>